<commit_message>
Added Customer Segmentation, Transitions, Recommendation, Intervention & Action Effectiveness
</commit_message>
<xml_diff>
--- a/docs/project_outline.docx
+++ b/docs/project_outline.docx
@@ -119,13 +119,7 @@
         <w:t xml:space="preserve"> transactional history for comprehensive customer journey mapping</w:t>
       </w:r>
       <w:r>
-        <w:t xml:space="preserve"> - </w:t>
-      </w:r>
-      <w:r>
-        <w:rPr>
-          <w:highlight w:val="yellow"/>
-        </w:rPr>
-        <w:t>Done</w:t>
+        <w:t xml:space="preserve"> </w:t>
       </w:r>
     </w:p>
     <w:p>
@@ -146,13 +140,7 @@
         <w:t>: Generate synthetic customer response data to simulate intervention outcomes and create feedback loops</w:t>
       </w:r>
       <w:r>
-        <w:t xml:space="preserve"> - </w:t>
-      </w:r>
-      <w:r>
-        <w:rPr>
-          <w:highlight w:val="yellow"/>
-        </w:rPr>
-        <w:t>Done</w:t>
+        <w:t xml:space="preserve"> </w:t>
       </w:r>
     </w:p>
     <w:p>
@@ -173,13 +161,7 @@
         <w:t>: Unified timestamp processing across datasets for consistent sequence analysis</w:t>
       </w:r>
       <w:r>
-        <w:t xml:space="preserve"> - </w:t>
-      </w:r>
-      <w:r>
-        <w:rPr>
-          <w:highlight w:val="yellow"/>
-        </w:rPr>
-        <w:t>Done</w:t>
+        <w:t xml:space="preserve"> </w:t>
       </w:r>
     </w:p>
     <w:p>
@@ -243,13 +225,7 @@
         <w:t>: Optimized for time-series analysis and rolling window calculations</w:t>
       </w:r>
       <w:r>
-        <w:t xml:space="preserve"> - </w:t>
-      </w:r>
-      <w:r>
-        <w:rPr>
-          <w:highlight w:val="yellow"/>
-        </w:rPr>
-        <w:t>Done</w:t>
+        <w:t xml:space="preserve"> </w:t>
       </w:r>
     </w:p>
     <w:p>
@@ -270,13 +246,7 @@
         <w:t>:</w:t>
       </w:r>
       <w:r>
-        <w:t xml:space="preserve"> - </w:t>
-      </w:r>
-      <w:r>
-        <w:rPr>
-          <w:highlight w:val="yellow"/>
-        </w:rPr>
-        <w:t>Done</w:t>
+        <w:t xml:space="preserve"> </w:t>
       </w:r>
     </w:p>
     <w:p>
@@ -345,13 +315,7 @@
         <w:t>: Optimized indexes for time-window queries and sequence analysis</w:t>
       </w:r>
       <w:r>
-        <w:t xml:space="preserve"> - </w:t>
-      </w:r>
-      <w:r>
-        <w:rPr>
-          <w:highlight w:val="yellow"/>
-        </w:rPr>
-        <w:t>Done</w:t>
+        <w:t xml:space="preserve"> </w:t>
       </w:r>
     </w:p>
     <w:p>
@@ -405,13 +369,7 @@
         <w:t>Rolling RFM metrics across multiple time windows (7, 30, 60, 90 days)</w:t>
       </w:r>
       <w:r>
-        <w:t xml:space="preserve"> - </w:t>
-      </w:r>
-      <w:r>
-        <w:rPr>
-          <w:highlight w:val="yellow"/>
-        </w:rPr>
-        <w:t>Done</w:t>
+        <w:t xml:space="preserve"> </w:t>
       </w:r>
     </w:p>
     <w:p>
@@ -427,18 +385,20 @@
       <w:r>
         <w:t xml:space="preserve"> </w:t>
       </w:r>
-      <w:r>
-        <w:t>–</w:t>
+    </w:p>
+    <w:p>
+      <w:pPr>
+        <w:numPr>
+          <w:ilvl w:val="0"/>
+          <w:numId w:val="3"/>
+        </w:numPr>
+      </w:pPr>
+      <w:r>
+        <w:t>Seasonality-adjusted engagement patterns</w:t>
       </w:r>
       <w:r>
         <w:t xml:space="preserve"> </w:t>
       </w:r>
-      <w:r>
-        <w:rPr>
-          <w:highlight w:val="green"/>
-        </w:rPr>
-        <w:t>Future Work</w:t>
-      </w:r>
     </w:p>
     <w:p>
       <w:pPr>
@@ -448,36 +408,10 @@
         </w:numPr>
       </w:pPr>
       <w:r>
-        <w:t>Seasonality-adjusted engagement patterns</w:t>
-      </w:r>
-      <w:r>
-        <w:t xml:space="preserve"> - </w:t>
-      </w:r>
-      <w:r>
-        <w:rPr>
-          <w:highlight w:val="green"/>
-        </w:rPr>
-        <w:t>Future Work</w:t>
-      </w:r>
-    </w:p>
-    <w:p>
-      <w:pPr>
-        <w:numPr>
-          <w:ilvl w:val="0"/>
-          <w:numId w:val="3"/>
-        </w:numPr>
-      </w:pPr>
-      <w:r>
         <w:t>Customer lifetime value projections with confidence intervals</w:t>
       </w:r>
       <w:r>
-        <w:t xml:space="preserve"> - </w:t>
-      </w:r>
-      <w:r>
-        <w:rPr>
-          <w:highlight w:val="green"/>
-        </w:rPr>
-        <w:t>Future Work</w:t>
+        <w:t xml:space="preserve"> </w:t>
       </w:r>
     </w:p>
     <w:p>
@@ -491,15 +425,6 @@
       <w:r>
         <w:t>:</w:t>
       </w:r>
-      <w:r>
-        <w:t xml:space="preserve"> - </w:t>
-      </w:r>
-      <w:r>
-        <w:rPr>
-          <w:highlight w:val="green"/>
-        </w:rPr>
-        <w:t>Future Work</w:t>
-      </w:r>
     </w:p>
     <w:p>
       <w:pPr>
@@ -575,13 +500,7 @@
         <w:t>:</w:t>
       </w:r>
       <w:r>
-        <w:t xml:space="preserve"> - </w:t>
-      </w:r>
-      <w:r>
-        <w:rPr>
-          <w:highlight w:val="yellow"/>
-        </w:rPr>
-        <w:t>Done</w:t>
+        <w:t xml:space="preserve"> </w:t>
       </w:r>
     </w:p>
     <w:p>
@@ -635,13 +554,7 @@
         <w:t>: Continuous risk assessment vs. binary classification</w:t>
       </w:r>
       <w:r>
-        <w:t xml:space="preserve"> - </w:t>
-      </w:r>
-      <w:r>
-        <w:rPr>
-          <w:highlight w:val="yellow"/>
-        </w:rPr>
-        <w:t>Done</w:t>
+        <w:t xml:space="preserve"> </w:t>
       </w:r>
     </w:p>
     <w:p>
@@ -662,13 +575,7 @@
         <w:t>: 30/60/90-day churn probability forecasts</w:t>
       </w:r>
       <w:r>
-        <w:t xml:space="preserve"> - </w:t>
-      </w:r>
-      <w:r>
-        <w:rPr>
-          <w:highlight w:val="yellow"/>
-        </w:rPr>
-        <w:t>Done</w:t>
+        <w:t xml:space="preserve"> </w:t>
       </w:r>
     </w:p>
     <w:p>
@@ -731,15 +638,6 @@
       <w:r>
         <w:t>:</w:t>
       </w:r>
-      <w:r>
-        <w:t xml:space="preserve"> - </w:t>
-      </w:r>
-      <w:r>
-        <w:rPr>
-          <w:highlight w:val="yellow"/>
-        </w:rPr>
-        <w:t>Done</w:t>
-      </w:r>
     </w:p>
     <w:p>
       <w:pPr>
@@ -777,19 +675,7 @@
         <w:t>: Facebook Prophet time-series forecasting of 3-month future customer values</w:t>
       </w:r>
       <w:r>
-        <w:t xml:space="preserve"> - </w:t>
-      </w:r>
-      <w:r>
-        <w:rPr>
-          <w:highlight w:val="green"/>
-        </w:rPr>
         <w:t xml:space="preserve"> </w:t>
-      </w:r>
-      <w:r>
-        <w:rPr>
-          <w:highlight w:val="green"/>
-        </w:rPr>
-        <w:t>Future Work</w:t>
       </w:r>
     </w:p>
     <w:p>
@@ -823,13 +709,7 @@
         <w:t>:</w:t>
       </w:r>
       <w:r>
-        <w:t xml:space="preserve"> - </w:t>
-      </w:r>
-      <w:r>
-        <w:rPr>
-          <w:highlight w:val="yellow"/>
-        </w:rPr>
-        <w:t>Done</w:t>
+        <w:t xml:space="preserve"> </w:t>
       </w:r>
     </w:p>
     <w:p>
@@ -916,13 +796,7 @@
         <w:t>:</w:t>
       </w:r>
       <w:r>
-        <w:t xml:space="preserve"> - </w:t>
-      </w:r>
-      <w:r>
-        <w:rPr>
-          <w:highlight w:val="yellow"/>
-        </w:rPr>
-        <w:t>Done</w:t>
+        <w:t xml:space="preserve"> </w:t>
       </w:r>
     </w:p>
     <w:p>
@@ -979,15 +853,6 @@
         </w:rPr>
         <w:t xml:space="preserve"> </w:t>
       </w:r>
-      <w:r>
-        <w:t xml:space="preserve">- </w:t>
-      </w:r>
-      <w:r>
-        <w:rPr>
-          <w:highlight w:val="yellow"/>
-        </w:rPr>
-        <w:t>Done</w:t>
-      </w:r>
     </w:p>
     <w:p>
       <w:r>
@@ -1132,51 +997,27 @@
       <w:r>
         <w:t xml:space="preserve"> </w:t>
       </w:r>
-      <w:r>
-        <w:t xml:space="preserve">- </w:t>
-      </w:r>
-      <w:r>
-        <w:rPr>
-          <w:highlight w:val="green"/>
+    </w:p>
+    <w:p>
+      <w:pPr>
+        <w:rPr>
+          <w:b/>
+          <w:bCs/>
+        </w:rPr>
+      </w:pPr>
+      <w:r>
+        <w:rPr>
+          <w:b/>
+          <w:bCs/>
+        </w:rPr>
+        <w:t>2.3 Causal Churn Prediction with Intervention Planning</w:t>
+      </w:r>
+      <w:r>
+        <w:rPr>
+          <w:b/>
+          <w:bCs/>
         </w:rPr>
         <w:t xml:space="preserve"> </w:t>
-      </w:r>
-      <w:r>
-        <w:rPr>
-          <w:highlight w:val="green"/>
-        </w:rPr>
-        <w:t>Future Work</w:t>
-      </w:r>
-    </w:p>
-    <w:p>
-      <w:pPr>
-        <w:rPr>
-          <w:b/>
-          <w:bCs/>
-        </w:rPr>
-      </w:pPr>
-      <w:r>
-        <w:rPr>
-          <w:b/>
-          <w:bCs/>
-        </w:rPr>
-        <w:t>2.3 Causal Churn Prediction with Intervention Planning</w:t>
-      </w:r>
-      <w:r>
-        <w:rPr>
-          <w:b/>
-          <w:bCs/>
-        </w:rPr>
-        <w:t xml:space="preserve"> </w:t>
-      </w:r>
-      <w:r>
-        <w:t xml:space="preserve">- </w:t>
-      </w:r>
-      <w:r>
-        <w:rPr>
-          <w:highlight w:val="yellow"/>
-        </w:rPr>
-        <w:t>Done</w:t>
       </w:r>
     </w:p>
     <w:p>
@@ -1383,15 +1224,6 @@
         </w:rPr>
         <w:t xml:space="preserve"> </w:t>
       </w:r>
-      <w:r>
-        <w:t xml:space="preserve">- </w:t>
-      </w:r>
-      <w:r>
-        <w:rPr>
-          <w:highlight w:val="yellow"/>
-        </w:rPr>
-        <w:t>Done</w:t>
-      </w:r>
     </w:p>
     <w:p>
       <w:r>
@@ -1548,15 +1380,6 @@
           <w:bCs/>
         </w:rPr>
         <w:t xml:space="preserve"> </w:t>
-      </w:r>
-      <w:r>
-        <w:t xml:space="preserve">- </w:t>
-      </w:r>
-      <w:r>
-        <w:rPr>
-          <w:highlight w:val="yellow"/>
-        </w:rPr>
-        <w:t>Done</w:t>
       </w:r>
     </w:p>
     <w:p>
@@ -1749,6 +1572,7 @@
       <w:r>
         <w:t xml:space="preserve"> </w:t>
       </w:r>
+      <w:proofErr w:type="gramStart"/>
       <w:r>
         <w:t xml:space="preserve">- </w:t>
       </w:r>
@@ -1762,7 +1586,14 @@
         <w:rPr>
           <w:highlight w:val="green"/>
         </w:rPr>
-        <w:t>Future Work</w:t>
+        <w:t>Future</w:t>
+      </w:r>
+      <w:proofErr w:type="gramEnd"/>
+      <w:r>
+        <w:rPr>
+          <w:highlight w:val="green"/>
+        </w:rPr>
+        <w:t xml:space="preserve"> Work</w:t>
       </w:r>
     </w:p>
     <w:p>
@@ -1778,6 +1609,7 @@
       <w:r>
         <w:t xml:space="preserve"> </w:t>
       </w:r>
+      <w:proofErr w:type="gramStart"/>
       <w:r>
         <w:t xml:space="preserve">- </w:t>
       </w:r>
@@ -1791,7 +1623,14 @@
         <w:rPr>
           <w:highlight w:val="green"/>
         </w:rPr>
-        <w:t>Future Work</w:t>
+        <w:t>Future</w:t>
+      </w:r>
+      <w:proofErr w:type="gramEnd"/>
+      <w:r>
+        <w:rPr>
+          <w:highlight w:val="green"/>
+        </w:rPr>
+        <w:t xml:space="preserve"> Work</w:t>
       </w:r>
     </w:p>
     <w:p>
@@ -5850,6 +5689,7 @@
   <w:style w:type="character" w:default="1" w:styleId="DefaultParagraphFont">
     <w:name w:val="Default Paragraph Font"/>
     <w:uiPriority w:val="1"/>
+    <w:semiHidden/>
     <w:unhideWhenUsed/>
   </w:style>
   <w:style w:type="table" w:default="1" w:styleId="TableNormal">

</xml_diff>